<commit_message>
feat(viñeta): adicion de tabla de metricas a dashboard | feat(informe): adicion de leyenda de tablas de anexo I
</commit_message>
<xml_diff>
--- a/inst/reports/assets/otros/tablas_versiones.docx
+++ b/inst/reports/assets/otros/tablas_versiones.docx
@@ -389,365 +389,6 @@
       </w:tr>
     </w:tbl>
     <w:p/>
-    <w:p/>
-    <w:tbl>
-      <w:tblPr>
-        <w:tblStyle w:val="Tablaconcuadrcula"/>
-        <w:tblW w:w="10065" w:type="dxa"/>
-        <w:tblInd w:w="-431" w:type="dxa"/>
-        <w:tblLook w:val="04A0" w:firstRow="1" w:lastRow="0" w:firstColumn="1" w:lastColumn="0" w:noHBand="0" w:noVBand="1"/>
-      </w:tblPr>
-      <w:tblGrid>
-        <w:gridCol w:w="2694"/>
-        <w:gridCol w:w="7371"/>
-      </w:tblGrid>
-      <w:tr>
-        <w:tc>
-          <w:tcPr>
-            <w:tcW w:w="10065" w:type="dxa"/>
-            <w:gridSpan w:val="2"/>
-          </w:tcPr>
-          <w:p>
-            <w:r>
-              <w:t>LEYENDA DE LAS TABLAS</w:t>
-            </w:r>
-          </w:p>
-        </w:tc>
-      </w:tr>
-      <w:tr>
-        <w:tc>
-          <w:tcPr>
-            <w:tcW w:w="2694" w:type="dxa"/>
-          </w:tcPr>
-          <w:p>
-            <w:r>
-              <w:t>Institución / Proyecto</w:t>
-            </w:r>
-          </w:p>
-        </w:tc>
-        <w:tc>
-          <w:tcPr>
-            <w:tcW w:w="7371" w:type="dxa"/>
-          </w:tcPr>
-          <w:p>
-            <w:r>
-              <w:t>Nombre de la entidad: institución, centro o proyecto general.</w:t>
-            </w:r>
-          </w:p>
-        </w:tc>
-      </w:tr>
-      <w:tr>
-        <w:tc>
-          <w:tcPr>
-            <w:tcW w:w="2694" w:type="dxa"/>
-          </w:tcPr>
-          <w:p>
-            <w:r>
-              <w:t>Colección / Base de</w:t>
-            </w:r>
-            <w:r>
-              <w:t xml:space="preserve"> </w:t>
-            </w:r>
-            <w:r>
-              <w:t>datos</w:t>
-            </w:r>
-          </w:p>
-        </w:tc>
-        <w:tc>
-          <w:tcPr>
-            <w:tcW w:w="7371" w:type="dxa"/>
-          </w:tcPr>
-          <w:p>
-            <w:r>
-              <w:t>Nombre de la colección o base de datos.</w:t>
-            </w:r>
-          </w:p>
-        </w:tc>
-      </w:tr>
-      <w:tr>
-        <w:tc>
-          <w:tcPr>
-            <w:tcW w:w="2694" w:type="dxa"/>
-          </w:tcPr>
-          <w:p>
-            <w:r>
-              <w:t>Código</w:t>
-            </w:r>
-          </w:p>
-        </w:tc>
-        <w:tc>
-          <w:tcPr>
-            <w:tcW w:w="7371" w:type="dxa"/>
-          </w:tcPr>
-          <w:p>
-            <w:r>
-              <w:t>Código de la colección o base de datos. Se indican también los códigos de las</w:t>
-            </w:r>
-          </w:p>
-          <w:p>
-            <w:r>
-              <w:t>colecciones que publican más de un recurso.</w:t>
-            </w:r>
-          </w:p>
-        </w:tc>
-      </w:tr>
-      <w:tr>
-        <w:tc>
-          <w:tcPr>
-            <w:tcW w:w="2694" w:type="dxa"/>
-          </w:tcPr>
-          <w:p>
-            <w:r>
-              <w:t>Localidad</w:t>
-            </w:r>
-          </w:p>
-        </w:tc>
-        <w:tc>
-          <w:tcPr>
-            <w:tcW w:w="7371" w:type="dxa"/>
-          </w:tcPr>
-          <w:p>
-            <w:r>
-              <w:t>Municipio (en su caso, la provincia figura entre paréntesis).</w:t>
-            </w:r>
-          </w:p>
-        </w:tc>
-      </w:tr>
-      <w:tr>
-        <w:tc>
-          <w:tcPr>
-            <w:tcW w:w="2694" w:type="dxa"/>
-          </w:tcPr>
-          <w:p>
-            <w:r>
-              <w:t>Ejemplares / Registros</w:t>
-            </w:r>
-            <w:r>
-              <w:t xml:space="preserve"> </w:t>
-            </w:r>
-            <w:r>
-              <w:t>(año)</w:t>
-            </w:r>
-          </w:p>
-        </w:tc>
-        <w:tc>
-          <w:tcPr>
-            <w:tcW w:w="7371" w:type="dxa"/>
-          </w:tcPr>
-          <w:p>
-            <w:r>
-              <w:t>Número de ejemplares o registros de la colección. En ocasiones no está</w:t>
-            </w:r>
-          </w:p>
-          <w:p>
-            <w:r>
-              <w:t xml:space="preserve">disponible y figura un </w:t>
-            </w:r>
-            <w:proofErr w:type="spellStart"/>
-            <w:r>
-              <w:t>guión</w:t>
-            </w:r>
-            <w:proofErr w:type="spellEnd"/>
-            <w:r>
-              <w:t xml:space="preserve"> (-).</w:t>
-            </w:r>
-          </w:p>
-          <w:p>
-            <w:r>
-              <w:t>A veces la colección, que suele ser un herbario, incluye imágenes y aparece su</w:t>
-            </w:r>
-          </w:p>
-          <w:p>
-            <w:r>
-              <w:t>número separado por una barra.</w:t>
-            </w:r>
-          </w:p>
-          <w:p>
-            <w:r>
-              <w:t>(Entre paréntesis figura la última actualización de metadatos en el Registro).</w:t>
-            </w:r>
-          </w:p>
-        </w:tc>
-      </w:tr>
-      <w:tr>
-        <w:tc>
-          <w:tcPr>
-            <w:tcW w:w="2694" w:type="dxa"/>
-          </w:tcPr>
-          <w:p>
-            <w:r>
-              <w:lastRenderedPageBreak/>
-              <w:t>Registros publicados</w:t>
-            </w:r>
-            <w:r>
-              <w:t xml:space="preserve"> </w:t>
-            </w:r>
-            <w:r>
-              <w:t>en GBIF (año)</w:t>
-            </w:r>
-          </w:p>
-        </w:tc>
-        <w:tc>
-          <w:tcPr>
-            <w:tcW w:w="7371" w:type="dxa"/>
-          </w:tcPr>
-          <w:p>
-            <w:r>
-              <w:t>Registros o juego de datos publicados en GBIF. En las colecciones o bases de</w:t>
-            </w:r>
-          </w:p>
-          <w:p>
-            <w:r>
-              <w:t>datos que tengan varios recursos publicados aparece la suma de estos juegos</w:t>
-            </w:r>
-          </w:p>
-          <w:p>
-            <w:r>
-              <w:t>de datos.</w:t>
-            </w:r>
-          </w:p>
-          <w:p>
-            <w:r>
-              <w:t>(Entre paréntesis figura la última actualización de datos en el Portal).</w:t>
-            </w:r>
-          </w:p>
-        </w:tc>
-      </w:tr>
-      <w:tr>
-        <w:tc>
-          <w:tcPr>
-            <w:tcW w:w="2694" w:type="dxa"/>
-          </w:tcPr>
-          <w:p>
-            <w:proofErr w:type="spellStart"/>
-            <w:r>
-              <w:t>Informat</w:t>
-            </w:r>
-            <w:proofErr w:type="spellEnd"/>
-            <w:r>
-              <w:t>.</w:t>
-            </w:r>
-          </w:p>
-        </w:tc>
-        <w:tc>
-          <w:tcPr>
-            <w:tcW w:w="7371" w:type="dxa"/>
-          </w:tcPr>
-          <w:p>
-            <w:r>
-              <w:t xml:space="preserve">Porcentaje de datos informatizados utilizando las aplicaciones </w:t>
-            </w:r>
-            <w:proofErr w:type="spellStart"/>
-            <w:r>
-              <w:t>Elysia</w:t>
-            </w:r>
-            <w:proofErr w:type="spellEnd"/>
-            <w:r>
-              <w:t xml:space="preserve">, </w:t>
-            </w:r>
-            <w:proofErr w:type="spellStart"/>
-            <w:r>
-              <w:t>Zoorbar</w:t>
-            </w:r>
-            <w:proofErr w:type="spellEnd"/>
-            <w:r>
-              <w:t>,</w:t>
-            </w:r>
-          </w:p>
-          <w:p>
-            <w:r>
-              <w:t>Herbar u otros sistemas para manejar sus registros.</w:t>
-            </w:r>
-          </w:p>
-          <w:p>
-            <w:r>
-              <w:t xml:space="preserve">En ocasiones no están informatizados y figura un </w:t>
-            </w:r>
-            <w:proofErr w:type="spellStart"/>
-            <w:r>
-              <w:t>guión</w:t>
-            </w:r>
-            <w:proofErr w:type="spellEnd"/>
-            <w:r>
-              <w:t xml:space="preserve"> (-).</w:t>
-            </w:r>
-          </w:p>
-        </w:tc>
-      </w:tr>
-      <w:tr>
-        <w:tc>
-          <w:tcPr>
-            <w:tcW w:w="2694" w:type="dxa"/>
-          </w:tcPr>
-          <w:p>
-            <w:proofErr w:type="spellStart"/>
-            <w:r>
-              <w:t>Georref</w:t>
-            </w:r>
-            <w:proofErr w:type="spellEnd"/>
-            <w:r>
-              <w:t>.</w:t>
-            </w:r>
-          </w:p>
-        </w:tc>
-        <w:tc>
-          <w:tcPr>
-            <w:tcW w:w="7371" w:type="dxa"/>
-          </w:tcPr>
-          <w:p>
-            <w:r>
-              <w:t>Porcentaje de datos georreferenciados.</w:t>
-            </w:r>
-          </w:p>
-          <w:p>
-            <w:r>
-              <w:t xml:space="preserve">En ocasiones no están georreferenciados y figura un </w:t>
-            </w:r>
-            <w:proofErr w:type="spellStart"/>
-            <w:r>
-              <w:t>guión</w:t>
-            </w:r>
-            <w:proofErr w:type="spellEnd"/>
-            <w:r>
-              <w:t xml:space="preserve"> (-).</w:t>
-            </w:r>
-          </w:p>
-        </w:tc>
-      </w:tr>
-      <w:tr>
-        <w:tc>
-          <w:tcPr>
-            <w:tcW w:w="2694" w:type="dxa"/>
-          </w:tcPr>
-          <w:p>
-            <w:r>
-              <w:t>Tipo (tipos de</w:t>
-            </w:r>
-            <w:r>
-              <w:t xml:space="preserve"> </w:t>
-            </w:r>
-            <w:r>
-              <w:t>recursos)</w:t>
-            </w:r>
-          </w:p>
-        </w:tc>
-        <w:tc>
-          <w:tcPr>
-            <w:tcW w:w="7371" w:type="dxa"/>
-          </w:tcPr>
-          <w:p>
-            <w:r>
-              <w:t>BD: Base de Datos (virtual).</w:t>
-            </w:r>
-          </w:p>
-          <w:p>
-            <w:r>
-              <w:t>CB: Colección Biológica (físico).</w:t>
-            </w:r>
-          </w:p>
-        </w:tc>
-      </w:tr>
-    </w:tbl>
     <w:p/>
     <w:sectPr>
       <w:pgSz w:w="11906" w:h="16838"/>

</xml_diff>